<commit_message>
Cap nhap sua loi
</commit_message>
<xml_diff>
--- a/DacTa_ToanBoHeThong_Nhom09.docx
+++ b/DacTa_ToanBoHeThong_Nhom09.docx
@@ -7,7 +7,7 @@
         <w:pStyle w:val="Heading1"/>
       </w:pPr>
       <w:r>
-        <w:t>ĐẶC TẢ YÊU CẦU HỆ THỐNG QUẢN LÝ SINH VIÊN</w:t>
+        <w:t>SYSTEM REQUIREMENTS SPECIFICATION FOR STUDENT MANAGEMENT SYSTEM</w:t>
       </w:r>
     </w:p>
     <w:p>
@@ -15,7 +15,7 @@
         <w:pStyle w:val="Heading2"/>
       </w:pPr>
       <w:r>
-        <w:t>1. Use-case: Đăng nhập hệ thống (Log in)</w:t>
+        <w:t>1. Use-case: Log in</w:t>
       </w:r>
     </w:p>
     <w:p>
@@ -23,13 +23,13 @@
         <w:pStyle w:val="Heading3"/>
       </w:pPr>
       <w:r>
-        <w:t>1.1. Tóm tắt</w:t>
+        <w:t>1.1. Summary</w:t>
       </w:r>
     </w:p>
     <w:p>
       <w:pPr/>
       <w:r>
-        <w:t>Use-case này cho phép Người dùng (Admin, Giảng viên, Sinh viên) đăng nhập vào hệ thống để truy cập giao diện tương ứng với phân quyền.</w:t>
+        <w:t>This use case allows Users (Admin, Lecturer, Student) to log in to the system to access the interface corresponding to their assigned permissions.</w:t>
       </w:r>
     </w:p>
     <w:p>
@@ -37,49 +37,49 @@
         <w:pStyle w:val="Heading3"/>
       </w:pPr>
       <w:r>
-        <w:t>1.2. Dòng sự kiện</w:t>
+        <w:t>1.2. Event Flow</w:t>
       </w:r>
     </w:p>
     <w:p>
       <w:pPr/>
       <w:r>
-        <w:t>1.2.1. Dòng sự kiện chính</w:t>
+        <w:t>1.2.1. Main Event Flow</w:t>
       </w:r>
     </w:p>
     <w:p>
       <w:pPr/>
       <w:r>
-        <w:t>Bước 1: Người dùng truy cập vào giao diện Đăng nhập chung của phần mềm.</w:t>
+        <w:t>Step 1: The User accesses the common Login interface of the software.</w:t>
       </w:r>
     </w:p>
     <w:p>
       <w:pPr/>
       <w:r>
-        <w:t>Bước 2: Hệ thống yêu cầu nhập thông tin xác thực gồm Tài khoản và Mật khẩu.</w:t>
+        <w:t>Step 2: The system requests authentication information including Account and Password.</w:t>
       </w:r>
     </w:p>
     <w:p>
       <w:pPr/>
       <w:r>
-        <w:t>Bước 3: Người dùng nhập thông tin và yêu cầu đăng nhập.</w:t>
+        <w:t>Step 3: The User enters the information and requests to log in.</w:t>
       </w:r>
     </w:p>
     <w:p>
       <w:pPr/>
       <w:r>
-        <w:t>Bước 4: Hệ thống kiểm tra hợp lệ, tự động xác định phân quyền và điều hướng người dùng vào giao diện phân hệ tương ứng.</w:t>
+        <w:t>Step 4: The system validates the information, automatically determines the user's permissions, and navigates the user to the corresponding module interface.</w:t>
       </w:r>
     </w:p>
     <w:p>
       <w:pPr/>
       <w:r>
-        <w:t>1.2.2. Các dòng sự kiện khác</w:t>
+        <w:t>1.2.2. Alternative Event Flows</w:t>
       </w:r>
     </w:p>
     <w:p>
       <w:pPr/>
       <w:r>
-        <w:t>Nếu thông tin không hợp lệ, hệ thống hiển thị thông báo lỗi sai tài khoản/mật khẩu và yêu cầu đăng nhập lại.</w:t>
+        <w:t>If the information is invalid, the system displays an error message indicating an incorrect account/password and requests the user to log in again.</w:t>
       </w:r>
     </w:p>
     <w:p>
@@ -87,19 +87,19 @@
         <w:pStyle w:val="Heading3"/>
       </w:pPr>
       <w:r>
-        <w:t>1.3. Các yêu cầu đặc biệt</w:t>
+        <w:t>1.3. Special Requirements</w:t>
       </w:r>
     </w:p>
     <w:p>
       <w:pPr/>
       <w:r>
-        <w:t>An toàn mật khẩu: 100% mật khẩu khi lưu trữ phải được mã hóa một chiều bằng thuật toán SHA-256.</w:t>
+        <w:t>Password Security: 100% of passwords stored must be one-way encrypted using the SHA-256 algorithm.</w:t>
       </w:r>
     </w:p>
     <w:p>
       <w:pPr/>
       <w:r>
-        <w:t>Quản lý phiên: Tự động đăng xuất (Auto-logout) nếu không có thao tác trong vòng 30 phút liên tục.</w:t>
+        <w:t>Session Management: Automatically log out (Auto-logout) if there is no activity for 30 consecutive minutes.</w:t>
       </w:r>
     </w:p>
     <w:p>
@@ -107,13 +107,13 @@
         <w:pStyle w:val="Heading3"/>
       </w:pPr>
       <w:r>
-        <w:t>1.4. Trạng thái hệ thống trước khi bắt đầu thực hiện Use-case</w:t>
+        <w:t>1.4. System State Before Starting the Use-case</w:t>
       </w:r>
     </w:p>
     <w:p>
       <w:pPr/>
       <w:r>
-        <w:t>Người dùng chưa đăng nhập vào hệ thống.</w:t>
+        <w:t>The User has not logged in to the system.</w:t>
       </w:r>
     </w:p>
     <w:p>
@@ -121,13 +121,13 @@
         <w:pStyle w:val="Heading3"/>
       </w:pPr>
       <w:r>
-        <w:t>1.5. Trạng thái hệ thống sau khi thực hiện Use-case</w:t>
+        <w:t>1.5. System State After Completing the Use-case</w:t>
       </w:r>
     </w:p>
     <w:p>
       <w:pPr/>
       <w:r>
-        <w:t>Người dùng được đăng nhập và điều hướng thành công.</w:t>
+        <w:t>The User is successfully logged in and navigated.</w:t>
       </w:r>
     </w:p>
     <w:p>
@@ -135,7 +135,7 @@
         <w:pStyle w:val="Heading2"/>
       </w:pPr>
       <w:r>
-        <w:t>2. Use-case: Quản lý Thông tin cá nhân (Manage Profile)</w:t>
+        <w:t>2. Use-case: Manage Profile</w:t>
       </w:r>
     </w:p>
     <w:p>
@@ -143,13 +143,13 @@
         <w:pStyle w:val="Heading3"/>
       </w:pPr>
       <w:r>
-        <w:t>2.1. Tóm tắt</w:t>
+        <w:t>2.1. Summary</w:t>
       </w:r>
     </w:p>
     <w:p>
       <w:pPr/>
       <w:r>
-        <w:t>Use-case này cho phép Giảng viên và Sinh viên xem và cập nhật thông tin cá nhân của mình.</w:t>
+        <w:t>This use case allows Lecturers and Students to view and update their personal information.</w:t>
       </w:r>
     </w:p>
     <w:p>
@@ -157,49 +157,49 @@
         <w:pStyle w:val="Heading3"/>
       </w:pPr>
       <w:r>
-        <w:t>2.2. Dòng sự kiện</w:t>
+        <w:t>2.2. Event Flow</w:t>
       </w:r>
     </w:p>
     <w:p>
       <w:pPr/>
       <w:r>
-        <w:t>2.2.1. Dòng sự kiện chính</w:t>
+        <w:t>2.2.1. Main Event Flow</w:t>
       </w:r>
     </w:p>
     <w:p>
       <w:pPr/>
       <w:r>
-        <w:t>Bước 1: Người dùng chọn chức năng Quản lý Thông tin cá nhân.</w:t>
+        <w:t>Step 1: The User selects the Manage Profile function.</w:t>
       </w:r>
     </w:p>
     <w:p>
       <w:pPr/>
       <w:r>
-        <w:t>Bước 2: Hệ thống hiển thị hồ sơ cá nhân hiện tại (Họ tên, SĐT, Email, Hình đại diện, Địa chỉ/Chức vụ).</w:t>
+        <w:t>Step 2: The system displays the current personal profile (Full Name, Phone Number, Email, Profile Picture, Address/Position).</w:t>
       </w:r>
     </w:p>
     <w:p>
       <w:pPr/>
       <w:r>
-        <w:t>Bước 3: Người dùng tiến hành chỉnh sửa và bấm nút Cập nhật/Lưu thay đổi.</w:t>
+        <w:t>Step 3: The User edits the information and clicks the Update/Save Changes button.</w:t>
       </w:r>
     </w:p>
     <w:p>
       <w:pPr/>
       <w:r>
-        <w:t>Bước 4: Hệ thống kiểm tra và cập nhật dữ liệu mới vào cơ sở dữ liệu.</w:t>
+        <w:t>Step 4: The system validates and updates the new data in the database.</w:t>
       </w:r>
     </w:p>
     <w:p>
       <w:pPr/>
       <w:r>
-        <w:t>1.2.2. Các dòng sự kiện khác</w:t>
+        <w:t>1.2.2. Alternative Event Flows</w:t>
       </w:r>
     </w:p>
     <w:p>
       <w:pPr/>
       <w:r>
-        <w:t>Nếu người dùng bỏ trống các thông tin bắt buộc, hệ thống báo lỗi và không lưu.</w:t>
+        <w:t>If the User leaves required information blank, the system displays an error and does not save the information.</w:t>
       </w:r>
     </w:p>
     <w:p>
@@ -207,13 +207,13 @@
         <w:pStyle w:val="Heading3"/>
       </w:pPr>
       <w:r>
-        <w:t>2.3. Các yêu cầu đặc biệt</w:t>
+        <w:t>2.3. Special Requirements</w:t>
       </w:r>
     </w:p>
     <w:p>
       <w:pPr/>
       <w:r>
-        <w:t>Không có.</w:t>
+        <w:t>None.</w:t>
       </w:r>
     </w:p>
     <w:p>
@@ -221,13 +221,13 @@
         <w:pStyle w:val="Heading3"/>
       </w:pPr>
       <w:r>
-        <w:t>2.4. Trạng thái hệ thống trước khi bắt đầu thực hiện Use-case</w:t>
+        <w:t>2.4. System State Before Starting the Use-case</w:t>
       </w:r>
     </w:p>
     <w:p>
       <w:pPr/>
       <w:r>
-        <w:t>Người dùng đã đăng nhập.</w:t>
+        <w:t>The User has logged in.</w:t>
       </w:r>
     </w:p>
     <w:p>
@@ -235,13 +235,13 @@
         <w:pStyle w:val="Heading3"/>
       </w:pPr>
       <w:r>
-        <w:t>2.5. Trạng thái hệ thống sau khi thực hiện Use-case</w:t>
+        <w:t>2.5. System State After Completing the Use-case</w:t>
       </w:r>
     </w:p>
     <w:p>
       <w:pPr/>
       <w:r>
-        <w:t>Thông tin cá nhân được cập nhật thành công.</w:t>
+        <w:t>The personal information is successfully updated.</w:t>
       </w:r>
     </w:p>
     <w:p>
@@ -249,7 +249,7 @@
         <w:pStyle w:val="Heading2"/>
       </w:pPr>
       <w:r>
-        <w:t>3. Use-case: Quản lý Lớp (Manage Classes)</w:t>
+        <w:t>3. Use-case: Manage Classes</w:t>
       </w:r>
     </w:p>
     <w:p>
@@ -257,13 +257,13 @@
         <w:pStyle w:val="Heading3"/>
       </w:pPr>
       <w:r>
-        <w:t>3.1. Tóm tắt</w:t>
+        <w:t>3.1. Summary</w:t>
       </w:r>
     </w:p>
     <w:p>
       <w:pPr/>
       <w:r>
-        <w:t>Use-case này cho phép Admin quản lý danh sách các lớp học cố định của sinh viên.</w:t>
+        <w:t>This use case allows the Admin to manage the list of fixed classes for students.</w:t>
       </w:r>
     </w:p>
     <w:p>
@@ -271,55 +271,55 @@
         <w:pStyle w:val="Heading3"/>
       </w:pPr>
       <w:r>
-        <w:t>3.2. Dòng sự kiện</w:t>
+        <w:t>3.2. Event Flow</w:t>
       </w:r>
     </w:p>
     <w:p>
       <w:pPr/>
       <w:r>
-        <w:t>3.2.1. Dòng sự kiện chính</w:t>
+        <w:t>3.2.1. Main Event Flow</w:t>
       </w:r>
     </w:p>
     <w:p>
       <w:pPr/>
       <w:r>
-        <w:t>Bước 1: Admin chọn chức năng Quản lý Lớp.</w:t>
+        <w:t>Step 1: The Admin selects the Manage Classes function.</w:t>
       </w:r>
     </w:p>
     <w:p>
       <w:pPr/>
       <w:r>
-        <w:t>Bước 2: Hệ thống hiển thị danh sách toàn bộ các lớp học.</w:t>
+        <w:t>Step 2: The system displays the complete list of classes.</w:t>
       </w:r>
     </w:p>
     <w:p>
       <w:pPr/>
       <w:r>
-        <w:t>Bước 3: Admin có thể chọn Thêm, Sửa, hoặc Xóa lớp học (gồm các thuộc tính: Tên lớp, Mã lớp, Thuộc khoa, Sĩ số).</w:t>
+        <w:t>Step 3: The Admin can choose to Add, Edit, or Delete a class (including the following attributes: Class Name, Class Code, Faculty, Class Size).</w:t>
       </w:r>
     </w:p>
     <w:p>
       <w:pPr/>
       <w:r>
-        <w:t>Bước 4: Admin gán sinh viên mới nhập học vào một lớp cố định.</w:t>
+        <w:t>Step 4: The Admin assigns newly admitted students to a fixed class.</w:t>
       </w:r>
     </w:p>
     <w:p>
       <w:pPr/>
       <w:r>
-        <w:t>Bước 5: Hệ thống lưu thay đổi và cập nhật danh sách.</w:t>
+        <w:t>Step 5: The system saves the changes and updates the list.</w:t>
       </w:r>
     </w:p>
     <w:p>
       <w:pPr/>
       <w:r>
-        <w:t>3.2.2. Các dòng sự kiện khác</w:t>
+        <w:t>3.2.2. Alternative Event Flows</w:t>
       </w:r>
     </w:p>
     <w:p>
       <w:pPr/>
       <w:r>
-        <w:t>Khi Xóa lớp, hệ thống yêu cầu xác nhận trước khi thực hiện xóa khỏi cơ sở dữ liệu.</w:t>
+        <w:t>When deleting a class, the system requests confirmation before deleting it from the database.</w:t>
       </w:r>
     </w:p>
     <w:p>
@@ -327,13 +327,13 @@
         <w:pStyle w:val="Heading3"/>
       </w:pPr>
       <w:r>
-        <w:t>3.3. Các yêu cầu đặc biệt</w:t>
+        <w:t>3.3. Special Requirements</w:t>
       </w:r>
     </w:p>
     <w:p>
       <w:pPr/>
       <w:r>
-        <w:t>Không có.</w:t>
+        <w:t>None.</w:t>
       </w:r>
     </w:p>
     <w:p>
@@ -341,13 +341,13 @@
         <w:pStyle w:val="Heading3"/>
       </w:pPr>
       <w:r>
-        <w:t>3.4. Trạng thái hệ thống trước khi bắt đầu thực hiện Use-case</w:t>
+        <w:t>3.4. System State Before Starting the Use-case</w:t>
       </w:r>
     </w:p>
     <w:p>
       <w:pPr/>
       <w:r>
-        <w:t>Admin đã đăng nhập.</w:t>
+        <w:t>The Admin has logged in.</w:t>
       </w:r>
     </w:p>
     <w:p>
@@ -355,13 +355,13 @@
         <w:pStyle w:val="Heading3"/>
       </w:pPr>
       <w:r>
-        <w:t>3.5. Trạng thái hệ thống sau khi thực hiện Use-case</w:t>
+        <w:t>3.5. System State After Completing the Use-case</w:t>
       </w:r>
     </w:p>
     <w:p>
       <w:pPr/>
       <w:r>
-        <w:t>Danh sách Lớp học được cập nhật.</w:t>
+        <w:t>The class list is updated.</w:t>
       </w:r>
     </w:p>
     <w:p>
@@ -369,7 +369,7 @@
         <w:pStyle w:val="Heading2"/>
       </w:pPr>
       <w:r>
-        <w:t>4. Use-case: Quản lý Lớp học phần (Manage Course Classes)</w:t>
+        <w:t>4. Use-case: Manage Course Classes</w:t>
       </w:r>
     </w:p>
     <w:p>
@@ -377,13 +377,13 @@
         <w:pStyle w:val="Heading3"/>
       </w:pPr>
       <w:r>
-        <w:t>4.1. Tóm tắt</w:t>
+        <w:t>4.1. Summary</w:t>
       </w:r>
     </w:p>
     <w:p>
       <w:pPr/>
       <w:r>
-        <w:t>Use-case này cho phép Admin quản lý danh sách các lớp học phần và gán danh sách sinh viên vào môn học.</w:t>
+        <w:t>This use case allows the Admin to manage the list of course classes and assign the list of students to a course.</w:t>
       </w:r>
     </w:p>
     <w:p>
@@ -391,49 +391,49 @@
         <w:pStyle w:val="Heading3"/>
       </w:pPr>
       <w:r>
-        <w:t>4.2. Dòng sự kiện</w:t>
+        <w:t>4.2. Event Flow</w:t>
       </w:r>
     </w:p>
     <w:p>
       <w:pPr/>
       <w:r>
-        <w:t>4.2.1. Dòng sự kiện chính</w:t>
+        <w:t>4.2.1. Main Event Flow</w:t>
       </w:r>
     </w:p>
     <w:p>
       <w:pPr/>
       <w:r>
-        <w:t>Bước 1: Admin chọn chức năng Quản lý Lớp học phần.</w:t>
+        <w:t>Step 1: The Admin selects the Manage Course Classes function.</w:t>
       </w:r>
     </w:p>
     <w:p>
       <w:pPr/>
       <w:r>
-        <w:t>Bước 2: Hệ thống hiển thị danh sách các lớp học phần.</w:t>
+        <w:t>Step 2: The system displays the list of course classes.</w:t>
       </w:r>
     </w:p>
     <w:p>
       <w:pPr/>
       <w:r>
-        <w:t>Bước 3: Admin thực hiện Thêm, Sửa, Xóa lớp học phần (Mã lớp HP, Tên môn, Học kì, Mã lớp, Giảng viên).</w:t>
+        <w:t>Step 3: The Admin performs Add, Edit, or Delete operations on a course class (Course Class Code, Course Name, Semester, Class Code, Lecturer).</w:t>
       </w:r>
     </w:p>
     <w:p>
       <w:pPr/>
       <w:r>
-        <w:t>Bước 4: Hệ thống tự động gán danh sách sinh viên của lớp cố định vào lớp học phần tương ứng thông qua Mã lớp.</w:t>
+        <w:t>Step 4: The system automatically assigns the list of students from the fixed class to the corresponding course class through the Class Code.</w:t>
       </w:r>
     </w:p>
     <w:p>
       <w:pPr/>
       <w:r>
-        <w:t>4.2.2. Các dòng sự kiện khác</w:t>
+        <w:t>4.2.2. Alternative Event Flows</w:t>
       </w:r>
     </w:p>
     <w:p>
       <w:pPr/>
       <w:r>
-        <w:t>Không có.</w:t>
+        <w:t>None.</w:t>
       </w:r>
     </w:p>
     <w:p>
@@ -441,13 +441,13 @@
         <w:pStyle w:val="Heading3"/>
       </w:pPr>
       <w:r>
-        <w:t>4.3. Các yêu cầu đặc biệt</w:t>
+        <w:t>4.3. Special Requirements</w:t>
       </w:r>
     </w:p>
     <w:p>
       <w:pPr/>
       <w:r>
-        <w:t>Không có.</w:t>
+        <w:t>None.</w:t>
       </w:r>
     </w:p>
     <w:p>
@@ -455,13 +455,13 @@
         <w:pStyle w:val="Heading3"/>
       </w:pPr>
       <w:r>
-        <w:t>4.4. Trạng thái hệ thống trước khi bắt đầu thực hiện Use-case</w:t>
+        <w:t>4.4. System State Before Starting the Use-case</w:t>
       </w:r>
     </w:p>
     <w:p>
       <w:pPr/>
       <w:r>
-        <w:t>Admin đã đăng nhập.</w:t>
+        <w:t>The Admin has logged in.</w:t>
       </w:r>
     </w:p>
     <w:p>
@@ -469,13 +469,13 @@
         <w:pStyle w:val="Heading3"/>
       </w:pPr>
       <w:r>
-        <w:t>4.5. Trạng thái hệ thống sau khi thực hiện Use-case</w:t>
+        <w:t>4.5. System State After Completing the Use-case</w:t>
       </w:r>
     </w:p>
     <w:p>
       <w:pPr/>
       <w:r>
-        <w:t>Lớp học phần được cập nhật và danh sách sinh viên tự động hiển thị trên tài khoản Giảng viên.</w:t>
+        <w:t>The course class is updated and the list of students is automatically displayed on the Lecturer's account.</w:t>
       </w:r>
     </w:p>
     <w:p>
@@ -483,7 +483,7 @@
         <w:pStyle w:val="Heading2"/>
       </w:pPr>
       <w:r>
-        <w:t>5. Use-case: Quản lý Sinh viên (Manage Students)</w:t>
+        <w:t>5. Use-case: Manage Students</w:t>
       </w:r>
     </w:p>
     <w:p>
@@ -491,13 +491,13 @@
         <w:pStyle w:val="Heading3"/>
       </w:pPr>
       <w:r>
-        <w:t>5.1. Tóm tắt</w:t>
+        <w:t>5.1. Summary</w:t>
       </w:r>
     </w:p>
     <w:p>
       <w:pPr/>
       <w:r>
-        <w:t>Use-case này cho phép Admin quản lý hồ sơ của toàn bộ sinh viên trong trường.</w:t>
+        <w:t>This use case allows the Admin to manage the profiles of all students in the university.</w:t>
       </w:r>
     </w:p>
     <w:p>
@@ -505,49 +505,49 @@
         <w:pStyle w:val="Heading3"/>
       </w:pPr>
       <w:r>
-        <w:t>5.2. Dòng sự kiện</w:t>
+        <w:t>5.2. Event Flow</w:t>
       </w:r>
     </w:p>
     <w:p>
       <w:pPr/>
       <w:r>
-        <w:t>5.2.1. Dòng sự kiện chính</w:t>
+        <w:t>5.2.1. Main Event Flow</w:t>
       </w:r>
     </w:p>
     <w:p>
       <w:pPr/>
       <w:r>
-        <w:t>Bước 1: Admin chọn chức năng Quản lý Sinh viên.</w:t>
+        <w:t>Step 1: The Admin selects the Manage Students function.</w:t>
       </w:r>
     </w:p>
     <w:p>
       <w:pPr/>
       <w:r>
-        <w:t>Bước 2: Hệ thống hiển thị danh sách tổng thể sinh viên.</w:t>
+        <w:t>Step 2: The system displays the overall student list.</w:t>
       </w:r>
     </w:p>
     <w:p>
       <w:pPr/>
       <w:r>
-        <w:t>Bước 3: Admin thực hiện các thao tác Thêm, Sửa, Xóa hồ sơ sinh viên.</w:t>
+        <w:t>Step 3: The Admin performs Add, Edit, or Delete operations on student profiles.</w:t>
       </w:r>
     </w:p>
     <w:p>
       <w:pPr/>
       <w:r>
-        <w:t>Bước 4: Hệ thống lưu lại các thay đổi vào cơ sở dữ liệu.</w:t>
+        <w:t>Step 4: The system saves the changes to the database.</w:t>
       </w:r>
     </w:p>
     <w:p>
       <w:pPr/>
       <w:r>
-        <w:t>5.2.2. Các dòng sự kiện khác</w:t>
+        <w:t>5.2.2. Alternative Event Flows</w:t>
       </w:r>
     </w:p>
     <w:p>
       <w:pPr/>
       <w:r>
-        <w:t>Hệ thống yêu cầu xác nhận trước khi Xóa hồ sơ sinh viên.</w:t>
+        <w:t>The system requests confirmation before deleting a student profile.</w:t>
       </w:r>
     </w:p>
     <w:p>
@@ -555,13 +555,13 @@
         <w:pStyle w:val="Heading3"/>
       </w:pPr>
       <w:r>
-        <w:t>5.3. Các yêu cầu đặc biệt</w:t>
+        <w:t>5.3. Special Requirements</w:t>
       </w:r>
     </w:p>
     <w:p>
       <w:pPr/>
       <w:r>
-        <w:t>Không có.</w:t>
+        <w:t>None.</w:t>
       </w:r>
     </w:p>
     <w:p>
@@ -569,13 +569,13 @@
         <w:pStyle w:val="Heading3"/>
       </w:pPr>
       <w:r>
-        <w:t>5.4. Trạng thái hệ thống trước khi bắt đầu thực hiện Use-case</w:t>
+        <w:t>5.4. System State Before Starting the Use-case</w:t>
       </w:r>
     </w:p>
     <w:p>
       <w:pPr/>
       <w:r>
-        <w:t>Admin đã đăng nhập.</w:t>
+        <w:t>The Admin has logged in.</w:t>
       </w:r>
     </w:p>
     <w:p>
@@ -583,13 +583,13 @@
         <w:pStyle w:val="Heading3"/>
       </w:pPr>
       <w:r>
-        <w:t>5.5. Trạng thái hệ thống sau khi thực hiện Use-case</w:t>
+        <w:t>5.5. System State After Completing the Use-case</w:t>
       </w:r>
     </w:p>
     <w:p>
       <w:pPr/>
       <w:r>
-        <w:t>Hồ sơ sinh viên được cập nhật.</w:t>
+        <w:t>The student profile is updated.</w:t>
       </w:r>
     </w:p>
     <w:p>
@@ -597,7 +597,7 @@
         <w:pStyle w:val="Heading2"/>
       </w:pPr>
       <w:r>
-        <w:t>6. Use-case: Quản lý Nhập điểm - Admin (Manage Grades)</w:t>
+        <w:t>6. Use-case: Manage Grades - Admin</w:t>
       </w:r>
     </w:p>
     <w:p>
@@ -605,13 +605,13 @@
         <w:pStyle w:val="Heading3"/>
       </w:pPr>
       <w:r>
-        <w:t>6.1. Tóm tắt</w:t>
+        <w:t>6.1. Summary</w:t>
       </w:r>
     </w:p>
     <w:p>
       <w:pPr/>
       <w:r>
-        <w:t>Use-case này cho phép Admin tìm kiếm lớp học phần và chỉnh sửa điểm số của sinh viên.</w:t>
+        <w:t>This use case allows the Admin to search for a course class and edit students' grades.</w:t>
       </w:r>
     </w:p>
     <w:p>
@@ -619,49 +619,49 @@
         <w:pStyle w:val="Heading3"/>
       </w:pPr>
       <w:r>
-        <w:t>6.2. Dòng sự kiện</w:t>
+        <w:t>6.2. Event Flow</w:t>
       </w:r>
     </w:p>
     <w:p>
       <w:pPr/>
       <w:r>
-        <w:t>6.2.1. Dòng sự kiện chính</w:t>
+        <w:t>6.2.1. Main Event Flow</w:t>
       </w:r>
     </w:p>
     <w:p>
       <w:pPr/>
       <w:r>
-        <w:t>Bước 1: Admin vào giao diện Nhập điểm và điền "Mã lớp học phần" vào ô Tìm kiếm.</w:t>
+        <w:t>Step 1: The Admin enters the Grade Entry interface and enters the "Course Class Code" in the Search field.</w:t>
       </w:r>
     </w:p>
     <w:p>
       <w:pPr/>
       <w:r>
-        <w:t>Bước 2: Hệ thống tự động hiển thị danh sách chi tiết sinh viên thuộc lớp học phần đó.</w:t>
+        <w:t>Step 2: The system automatically displays the detailed list of students belonging to that course class.</w:t>
       </w:r>
     </w:p>
     <w:p>
       <w:pPr/>
       <w:r>
-        <w:t>Bước 3: Admin tiến hành chỉnh sửa điểm quá trình và điểm cuối kỳ của sinh viên.</w:t>
+        <w:t>Step 3: The Admin edits the coursework grade and final exam grade of the students.</w:t>
       </w:r>
     </w:p>
     <w:p>
       <w:pPr/>
       <w:r>
-        <w:t>Bước 4: Admin nhấn Lưu, hệ thống cập nhật điểm số mới.</w:t>
+        <w:t>Step 4: The Admin clicks Save, and the system updates the new grades.</w:t>
       </w:r>
     </w:p>
     <w:p>
       <w:pPr/>
       <w:r>
-        <w:t>6.2.2. Các dòng sự kiện khác</w:t>
+        <w:t>6.2.2. Alternative Event Flows</w:t>
       </w:r>
     </w:p>
     <w:p>
       <w:pPr/>
       <w:r>
-        <w:t>Nếu nhập sai mã lớp, hệ thống báo không tìm thấy kết quả.</w:t>
+        <w:t>If an incorrect class code is entered, the system displays a message indicating that no results were found.</w:t>
       </w:r>
     </w:p>
     <w:p>
@@ -669,13 +669,13 @@
         <w:pStyle w:val="Heading3"/>
       </w:pPr>
       <w:r>
-        <w:t>6.3. Các yêu cầu đặc biệt</w:t>
+        <w:t>6.3. Special Requirements</w:t>
       </w:r>
     </w:p>
     <w:p>
       <w:pPr/>
       <w:r>
-        <w:t>Thời gian tải và hiển thị danh sách sinh viên sau khi tìm kiếm phải nhỏ hơn hoặc bằng 2 giây.</w:t>
+        <w:t>The loading and display time for the student list after searching must be less than or equal to 2 seconds.</w:t>
       </w:r>
     </w:p>
     <w:p>
@@ -683,13 +683,13 @@
         <w:pStyle w:val="Heading3"/>
       </w:pPr>
       <w:r>
-        <w:t>6.4. Trạng thái hệ thống trước khi bắt đầu thực hiện Use-case</w:t>
+        <w:t>6.4. System State Before Starting the Use-case</w:t>
       </w:r>
     </w:p>
     <w:p>
       <w:pPr/>
       <w:r>
-        <w:t>Admin đã đăng nhập.</w:t>
+        <w:t>The Admin has logged in.</w:t>
       </w:r>
     </w:p>
     <w:p>
@@ -697,13 +697,13 @@
         <w:pStyle w:val="Heading3"/>
       </w:pPr>
       <w:r>
-        <w:t>6.5. Trạng thái hệ thống sau khi thực hiện Use-case</w:t>
+        <w:t>6.5. System State After Completing the Use-case</w:t>
       </w:r>
     </w:p>
     <w:p>
       <w:pPr/>
       <w:r>
-        <w:t>Điểm số sinh viên được cập nhật.</w:t>
+        <w:t>The students' grades are updated.</w:t>
       </w:r>
     </w:p>
     <w:p>
@@ -711,7 +711,7 @@
         <w:pStyle w:val="Heading2"/>
       </w:pPr>
       <w:r>
-        <w:t>7. Use-case: Xem Danh sách Lớp phụ trách (View Assigned Classes)</w:t>
+        <w:t>7. Use-case: View Assigned Classes</w:t>
       </w:r>
     </w:p>
     <w:p>
@@ -719,13 +719,13 @@
         <w:pStyle w:val="Heading3"/>
       </w:pPr>
       <w:r>
-        <w:t>7.1. Tóm tắt</w:t>
+        <w:t>7.1. Summary</w:t>
       </w:r>
     </w:p>
     <w:p>
       <w:pPr/>
       <w:r>
-        <w:t>Use-case này cho phép Giảng viên xem danh sách các lớp học phần mình phụ trách và xem chi tiết sinh viên.</w:t>
+        <w:t>This use case allows the Lecturer to view the list of course classes they are responsible for and view student details.</w:t>
       </w:r>
     </w:p>
     <w:p>
@@ -733,49 +733,49 @@
         <w:pStyle w:val="Heading3"/>
       </w:pPr>
       <w:r>
-        <w:t>7.2. Dòng sự kiện</w:t>
+        <w:t>7.2. Event Flow</w:t>
       </w:r>
     </w:p>
     <w:p>
       <w:pPr/>
       <w:r>
-        <w:t>7.2.1. Dòng sự kiện chính</w:t>
+        <w:t>7.2.1. Main Event Flow</w:t>
       </w:r>
     </w:p>
     <w:p>
       <w:pPr/>
       <w:r>
-        <w:t>Bước 1: Giảng viên chọn chức năng Lớp của tôi.</w:t>
+        <w:t>Step 1: The Lecturer selects the My Classes function.</w:t>
       </w:r>
     </w:p>
     <w:p>
       <w:pPr/>
       <w:r>
-        <w:t>Bước 2: Hệ thống hiển thị danh sách các lớp học phần mà giảng viên đó phụ trách (ẩn các lớp khác).</w:t>
+        <w:t>Step 2: The system displays the list of course classes assigned to that Lecturer (hiding other classes).</w:t>
       </w:r>
     </w:p>
     <w:p>
       <w:pPr/>
       <w:r>
-        <w:t>Bước 3: Giảng viên bấm nút Chi tiết tại một lớp.</w:t>
+        <w:t>Step 3: The Lecturer clicks the Details button for a class.</w:t>
       </w:r>
     </w:p>
     <w:p>
       <w:pPr/>
       <w:r>
-        <w:t>Bước 4: Hệ thống hiển thị danh sách sinh viên trong lớp gồm: STT, MSSV, Họ tên, Điểm quá trình, Điểm cuối kỳ, Tổng điểm.</w:t>
+        <w:t>Step 4: The system displays the list of students in the class including: No., Student ID, Full Name, Coursework Grade, Final Exam Grade, Total Grade.</w:t>
       </w:r>
     </w:p>
     <w:p>
       <w:pPr/>
       <w:r>
-        <w:t>7.2.2. Các dòng sự kiện khác</w:t>
+        <w:t>7.2.2. Alternative Event Flows</w:t>
       </w:r>
     </w:p>
     <w:p>
       <w:pPr/>
       <w:r>
-        <w:t>Không có.</w:t>
+        <w:t>None.</w:t>
       </w:r>
     </w:p>
     <w:p>
@@ -783,13 +783,13 @@
         <w:pStyle w:val="Heading3"/>
       </w:pPr>
       <w:r>
-        <w:t>7.3. Các yêu cầu đặc biệt</w:t>
+        <w:t>7.3. Special Requirements</w:t>
       </w:r>
     </w:p>
     <w:p>
       <w:pPr/>
       <w:r>
-        <w:t>Thời gian chuyển đổi và tải danh sách lớp không vượt quá 2 giây.</w:t>
+        <w:t>The class list transition and loading time must not exceed 2 seconds.</w:t>
       </w:r>
     </w:p>
     <w:p>
@@ -797,13 +797,13 @@
         <w:pStyle w:val="Heading3"/>
       </w:pPr>
       <w:r>
-        <w:t>7.4. Trạng thái hệ thống trước khi bắt đầu thực hiện Use-case</w:t>
+        <w:t>7.4. System State Before Starting the Use-case</w:t>
       </w:r>
     </w:p>
     <w:p>
       <w:pPr/>
       <w:r>
-        <w:t>Giảng viên đã đăng nhập.</w:t>
+        <w:t>The Lecturer has logged in.</w:t>
       </w:r>
     </w:p>
     <w:p>
@@ -811,13 +811,13 @@
         <w:pStyle w:val="Heading3"/>
       </w:pPr>
       <w:r>
-        <w:t>7.5. Trạng thái hệ thống sau khi thực hiện Use-case</w:t>
+        <w:t>7.5. System State After Completing the Use-case</w:t>
       </w:r>
     </w:p>
     <w:p>
       <w:pPr/>
       <w:r>
-        <w:t>Không có thay đổi dữ liệu.</w:t>
+        <w:t>There is no data change.</w:t>
       </w:r>
     </w:p>
     <w:p>
@@ -825,7 +825,7 @@
         <w:pStyle w:val="Heading2"/>
       </w:pPr>
       <w:r>
-        <w:t>8. Use-case: Xem và Nhập Bảng điểm (View/Enter Grades)</w:t>
+        <w:t>8. Use-case: View/Enter Grades</w:t>
       </w:r>
     </w:p>
     <w:p>
@@ -833,13 +833,13 @@
         <w:pStyle w:val="Heading3"/>
       </w:pPr>
       <w:r>
-        <w:t>8.1. Tóm tắt</w:t>
+        <w:t>8.1. Summary</w:t>
       </w:r>
     </w:p>
     <w:p>
       <w:pPr/>
       <w:r>
-        <w:t>Use-case này cho phép Giảng viên nhập điểm thành phần cho lớp mình dạy, và cho phép Sinh viên xem bảng kết quả học tập.</w:t>
+        <w:t>This use case allows the Lecturer to enter component grades for the class they teach, and allows the Student to view their academic results.</w:t>
       </w:r>
     </w:p>
     <w:p>
@@ -847,67 +847,67 @@
         <w:pStyle w:val="Heading3"/>
       </w:pPr>
       <w:r>
-        <w:t>8.2. Dòng sự kiện</w:t>
+        <w:t>8.2. Event Flow</w:t>
       </w:r>
     </w:p>
     <w:p>
       <w:pPr/>
       <w:r>
-        <w:t>8.2.1. Dòng sự kiện chính (Đối với Giảng viên)</w:t>
+        <w:t>8.2.1. Main Event Flow (For Lecturer)</w:t>
       </w:r>
     </w:p>
     <w:p>
       <w:pPr/>
       <w:r>
-        <w:t>Bước 1: Từ danh sách sinh viên của Lớp phụ trách, Giảng viên nhập/sửa điểm chuyên cần, giữa kỳ, cuối kỳ trực tiếp vào các ô tương ứng.</w:t>
+        <w:t>Step 1: From the student list of the Assigned Class, the Lecturer enters/edits attendance, midterm, and final exam grades directly into the corresponding fields.</w:t>
       </w:r>
     </w:p>
     <w:p>
       <w:pPr/>
       <w:r>
-        <w:t>Bước 2: Giảng viên bấm lưu.</w:t>
+        <w:t>Step 2: The Lecturer clicks Save.</w:t>
       </w:r>
     </w:p>
     <w:p>
       <w:pPr/>
       <w:r>
-        <w:t>Bước 3: Hệ thống tự động tính toán điểm tổng kết môn học cho sinh viên.</w:t>
+        <w:t>Step 3: The system automatically calculates the final course grade for the student.</w:t>
       </w:r>
     </w:p>
     <w:p>
       <w:pPr/>
       <w:r>
-        <w:t>8.2.2. Dòng sự kiện chính (Đối với Sinh viên)</w:t>
+        <w:t>8.2.2. Main Event Flow (For Student)</w:t>
       </w:r>
     </w:p>
     <w:p>
       <w:pPr/>
       <w:r>
-        <w:t>Bước 1: Sinh viên chọn chức năng Xem Bảng điểm.</w:t>
+        <w:t>Step 1: The Student selects the View Grades function.</w:t>
       </w:r>
     </w:p>
     <w:p>
       <w:pPr/>
       <w:r>
-        <w:t>Bước 2: Hệ thống hiển thị số môn đã học, GPA và Xếp loại.</w:t>
+        <w:t>Step 2: The system displays the number of courses completed, GPA, and Classification.</w:t>
       </w:r>
     </w:p>
     <w:p>
       <w:pPr/>
       <w:r>
-        <w:t>Bước 3: Hệ thống hiển thị chi tiết điểm chuyên cần, giữa kỳ, cuối kỳ và điểm tổng kết của từng môn.</w:t>
+        <w:t>Step 3: The system displays detailed attendance, midterm, final exam, and final grades for each course.</w:t>
       </w:r>
     </w:p>
     <w:p>
       <w:pPr/>
       <w:r>
-        <w:t>8.2.3. Các dòng sự kiện khác</w:t>
+        <w:t>8.2.3. Alternative Event Flows</w:t>
       </w:r>
     </w:p>
     <w:p>
       <w:pPr/>
       <w:r>
-        <w:t>Đối với Sinh viên, chức năng này chỉ cho phép Xem (Read-only), không được chỉnh sửa.</w:t>
+        <w:t>For Students, this function is Read-only and does not allow editing.</w:t>
       </w:r>
     </w:p>
     <w:p>
@@ -915,13 +915,13 @@
         <w:pStyle w:val="Heading3"/>
       </w:pPr>
       <w:r>
-        <w:t>8.3. Các yêu cầu đặc biệt</w:t>
+        <w:t>8.3. Special Requirements</w:t>
       </w:r>
     </w:p>
     <w:p>
       <w:pPr/>
       <w:r>
-        <w:t>Hệ thống không bị sập khi có ít nhất 500 sinh viên cùng lúc truy cập xem Bảng điểm.</w:t>
+        <w:t>The system must not crash when at least 500 students access the Grade Report simultaneously.</w:t>
       </w:r>
     </w:p>
     <w:p>
@@ -929,13 +929,13 @@
         <w:pStyle w:val="Heading3"/>
       </w:pPr>
       <w:r>
-        <w:t>8.4. Trạng thái hệ thống trước khi bắt đầu thực hiện Use-case</w:t>
+        <w:t>8.4. System State Before Starting the Use-case</w:t>
       </w:r>
     </w:p>
     <w:p>
       <w:pPr/>
       <w:r>
-        <w:t>Người dùng đã đăng nhập.</w:t>
+        <w:t>The User has logged in.</w:t>
       </w:r>
     </w:p>
     <w:p>
@@ -943,13 +943,13 @@
         <w:pStyle w:val="Heading3"/>
       </w:pPr>
       <w:r>
-        <w:t>8.5. Trạng thái hệ thống sau khi thực hiện Use-case</w:t>
+        <w:t>8.5. System State After Completing the Use-case</w:t>
       </w:r>
     </w:p>
     <w:p>
       <w:pPr/>
       <w:r>
-        <w:t>Nếu Giảng viên nhập điểm, cơ sở dữ liệu điểm được cập nhật. Nếu Sinh viên xem điểm, trạng thái không đổi.</w:t>
+        <w:t>If the Lecturer enters grades, the grade database is updated. If the Student views grades, the state remains unchanged.</w:t>
       </w:r>
     </w:p>
     <w:sectPr>
@@ -1331,6 +1331,7 @@
     </w:pPr>
     <w:rPr>
       <w:rFonts w:ascii="Times New Roman" w:hAnsi="Times New Roman"/>
+      <w:b w:val="0"/>
       <w:sz w:val="26"/>
     </w:rPr>
   </w:style>

</xml_diff>